<commit_message>
new changes with recognitions
</commit_message>
<xml_diff>
--- a/Prasad_MK.docx
+++ b/Prasad_MK.docx
@@ -37,70 +37,7 @@
           <w:bCs/>
           <w:color w:val="0066CC"/>
         </w:rPr>
-        <w:t xml:space="preserve">Solution Architect </w:t>
-      </w:r>
-      <w:r>
-        <w:rPr>
-          <w:rFonts w:ascii="SF Pro" w:hAnsi="SF Pro"/>
-          <w:b/>
-          <w:bCs/>
-          <w:color w:val="0066CC"/>
-        </w:rPr>
-        <w:t>·</w:t>
-      </w:r>
-      <w:r>
-        <w:rPr>
-          <w:rFonts w:ascii="SF Pro" w:hAnsi="SF Pro"/>
-          <w:b/>
-          <w:bCs/>
-          <w:color w:val="0066CC"/>
-        </w:rPr>
-        <w:t xml:space="preserve"> </w:t>
-      </w:r>
-      <w:r>
-        <w:rPr>
-          <w:rFonts w:ascii="SF Pro" w:hAnsi="SF Pro"/>
-          <w:b/>
-          <w:bCs/>
-          <w:color w:val="0066CC"/>
-        </w:rPr>
-        <w:t xml:space="preserve">Site Reliability Engineer · </w:t>
-      </w:r>
-      <w:r>
-        <w:rPr>
-          <w:rFonts w:ascii="SF Pro" w:hAnsi="SF Pro"/>
-          <w:b/>
-          <w:bCs/>
-          <w:color w:val="0066CC"/>
-        </w:rPr>
-        <w:t xml:space="preserve">Backend Engineer </w:t>
-      </w:r>
-      <w:r>
-        <w:rPr>
-          <w:rFonts w:ascii="SF Pro" w:hAnsi="SF Pro"/>
-          <w:b/>
-          <w:bCs/>
-          <w:color w:val="0066CC"/>
-        </w:rPr>
-        <w:t xml:space="preserve">· Infrastructure </w:t>
-      </w:r>
-      <w:r>
-        <w:rPr>
-          <w:rFonts w:ascii="SF Pro" w:hAnsi="SF Pro"/>
-          <w:b/>
-          <w:bCs/>
-          <w:color w:val="0066CC"/>
-        </w:rPr>
-        <w:t xml:space="preserve">Engineer </w:t>
-      </w:r>
-      <w:r>
-        <w:rPr>
-          <w:rFonts w:ascii="SF Pro" w:hAnsi="SF Pro"/>
-          <w:b/>
-          <w:bCs/>
-          <w:color w:val="0066CC"/>
-        </w:rPr>
-        <w:t>· AI Platforms</w:t>
+        <w:t>Solution Architect · Agentic AI &amp; Backend · SRE, Infrastructure &amp; Platform Engineer</w:t>
       </w:r>
     </w:p>
     <w:p>
@@ -717,25 +654,79 @@
                 <w:sz w:val="18"/>
                 <w:szCs w:val="18"/>
               </w:rPr>
-              <w:t>Agent trust boundary design (</w:t>
-            </w:r>
-            <w:r>
-              <w:rPr>
-                <w:rFonts w:ascii="SF Pro" w:hAnsi="SF Pro"/>
-                <w:color w:val="1A1A1A"/>
-                <w:sz w:val="18"/>
-                <w:szCs w:val="18"/>
-              </w:rPr>
-              <w:t>preprint</w:t>
-            </w:r>
-            <w:r>
-              <w:rPr>
-                <w:rFonts w:ascii="SF Pro" w:hAnsi="SF Pro"/>
-                <w:color w:val="1A1A1A"/>
-                <w:sz w:val="18"/>
-                <w:szCs w:val="18"/>
-              </w:rPr>
-              <w:t>), SOC2 compliance, DR strategy, access controls, security scanning (0% critical vulns in prod)</w:t>
+              <w:t xml:space="preserve">Agent trust boundary design, SOC2 compliance, DR strategy, </w:t>
+            </w:r>
+            <w:r>
+              <w:rPr>
+                <w:rFonts w:ascii="SF Pro" w:hAnsi="SF Pro"/>
+                <w:color w:val="1A1A1A"/>
+                <w:sz w:val="18"/>
+                <w:szCs w:val="18"/>
+              </w:rPr>
+              <w:t>A</w:t>
+            </w:r>
+            <w:r>
+              <w:rPr>
+                <w:rFonts w:ascii="SF Pro" w:hAnsi="SF Pro"/>
+                <w:color w:val="1A1A1A"/>
+                <w:sz w:val="18"/>
+                <w:szCs w:val="18"/>
+              </w:rPr>
+              <w:t xml:space="preserve">ccess </w:t>
+            </w:r>
+            <w:r>
+              <w:rPr>
+                <w:rFonts w:ascii="SF Pro" w:hAnsi="SF Pro"/>
+                <w:color w:val="1A1A1A"/>
+                <w:sz w:val="18"/>
+                <w:szCs w:val="18"/>
+              </w:rPr>
+              <w:t>C</w:t>
+            </w:r>
+            <w:r>
+              <w:rPr>
+                <w:rFonts w:ascii="SF Pro" w:hAnsi="SF Pro"/>
+                <w:color w:val="1A1A1A"/>
+                <w:sz w:val="18"/>
+                <w:szCs w:val="18"/>
+              </w:rPr>
+              <w:t xml:space="preserve">ontrols, </w:t>
+            </w:r>
+            <w:r>
+              <w:rPr>
+                <w:rFonts w:ascii="SF Pro" w:hAnsi="SF Pro"/>
+                <w:color w:val="1A1A1A"/>
+                <w:sz w:val="18"/>
+                <w:szCs w:val="18"/>
+              </w:rPr>
+              <w:t>S</w:t>
+            </w:r>
+            <w:r>
+              <w:rPr>
+                <w:rFonts w:ascii="SF Pro" w:hAnsi="SF Pro"/>
+                <w:color w:val="1A1A1A"/>
+                <w:sz w:val="18"/>
+                <w:szCs w:val="18"/>
+              </w:rPr>
+              <w:t xml:space="preserve">ecurity </w:t>
+            </w:r>
+            <w:r>
+              <w:rPr>
+                <w:rFonts w:ascii="SF Pro" w:hAnsi="SF Pro"/>
+                <w:color w:val="1A1A1A"/>
+                <w:sz w:val="18"/>
+                <w:szCs w:val="18"/>
+              </w:rPr>
+              <w:t>S</w:t>
+            </w:r>
+            <w:r>
+              <w:rPr>
+                <w:rFonts w:ascii="SF Pro" w:hAnsi="SF Pro"/>
+                <w:color w:val="1A1A1A"/>
+                <w:sz w:val="18"/>
+                <w:szCs w:val="18"/>
+              </w:rPr>
+              <w:t>canning (0% critical vulns in prod)</w:t>
             </w:r>
           </w:p>
         </w:tc>
@@ -2955,7 +2946,6 @@
   <w:style w:type="character" w:default="1" w:styleId="DefaultParagraphFont">
     <w:name w:val="Default Paragraph Font"/>
     <w:uiPriority w:val="1"/>
-    <w:semiHidden/>
     <w:unhideWhenUsed/>
   </w:style>
   <w:style w:type="table" w:default="1" w:styleId="TableNormal">

</xml_diff>